<commit_message>
docs: log English migration decisions in the AI diary
</commit_message>
<xml_diff>
--- a/docs/Diario_Decisiones_IA.docx
+++ b/docs/Diario_Decisiones_IA.docx
@@ -13347,6 +13347,1530 @@
       </w:pPr>
     </w:p>
     <w:p>
+      <w:pPr>
+        <w:pStyle w:val="Heading2"/>
+        <w:spacing w:after="140" w:before="280"/>
+      </w:pPr>
+      <w:r>
+        <w:rPr>
+          <w:b/>
+          <w:bCs/>
+          <w:color w:val="1F4E79"/>
+          <w:sz w:val="25"/>
+          <w:szCs w:val="25"/>
+        </w:rPr>
+        <w:t xml:space="preserve">Entrada 26 — Corrección del README: el nombre de la base divergía del entorno</w:t>
+      </w:r>
+    </w:p>
+    <w:tbl>
+      <w:tblPr>
+        <w:tblW w:type="dxa" w:w="9360"/>
+        <w:tblBorders>
+          <w:top w:val="single" w:color="auto" w:sz="4"/>
+          <w:left w:val="single" w:color="auto" w:sz="4"/>
+          <w:bottom w:val="single" w:color="auto" w:sz="4"/>
+          <w:right w:val="single" w:color="auto" w:sz="4"/>
+          <w:insideH w:val="single" w:color="auto" w:sz="4"/>
+          <w:insideV w:val="single" w:color="auto" w:sz="4"/>
+        </w:tblBorders>
+      </w:tblPr>
+      <w:tblGrid>
+        <w:gridCol w:w="2400"/>
+        <w:gridCol w:w="6960"/>
+      </w:tblGrid>
+      <w:tr>
+        <w:tc>
+          <w:tcPr>
+            <w:tcW w:type="dxa" w:w="2400"/>
+            <w:shd w:fill="F2F2F2" w:color="auto" w:val="clear"/>
+            <w:tcMar>
+              <w:top w:type="dxa" w:w="80"/>
+              <w:left w:type="dxa" w:w="120"/>
+              <w:bottom w:type="dxa" w:w="80"/>
+              <w:right w:type="dxa" w:w="120"/>
+            </w:tcMar>
+          </w:tcPr>
+          <w:p>
+            <w:pPr>
+              <w:spacing w:after="120" w:line="276"/>
+            </w:pPr>
+            <w:r>
+              <w:rPr>
+                <w:b/>
+                <w:bCs/>
+                <w:sz w:val="21"/>
+                <w:szCs w:val="21"/>
+              </w:rPr>
+              <w:t xml:space="preserve">Fecha</w:t>
+            </w:r>
+          </w:p>
+        </w:tc>
+        <w:tc>
+          <w:tcPr>
+            <w:tcW w:type="dxa" w:w="6960"/>
+            <w:tcMar>
+              <w:top w:type="dxa" w:w="80"/>
+              <w:left w:type="dxa" w:w="120"/>
+              <w:bottom w:type="dxa" w:w="80"/>
+              <w:right w:type="dxa" w:w="120"/>
+            </w:tcMar>
+          </w:tcPr>
+          <w:p>
+            <w:pPr>
+              <w:spacing w:after="0" w:line="276"/>
+            </w:pPr>
+            <w:r>
+              <w:rPr>
+                <w:sz w:val="21"/>
+                <w:szCs w:val="21"/>
+              </w:rPr>
+              <w:t xml:space="preserve">02/08/2026</w:t>
+            </w:r>
+          </w:p>
+        </w:tc>
+      </w:tr>
+      <w:tr>
+        <w:tc>
+          <w:tcPr>
+            <w:tcW w:type="dxa" w:w="2400"/>
+            <w:shd w:fill="F2F2F2" w:color="auto" w:val="clear"/>
+            <w:tcMar>
+              <w:top w:type="dxa" w:w="80"/>
+              <w:left w:type="dxa" w:w="120"/>
+              <w:bottom w:type="dxa" w:w="80"/>
+              <w:right w:type="dxa" w:w="120"/>
+            </w:tcMar>
+          </w:tcPr>
+          <w:p>
+            <w:pPr>
+              <w:spacing w:after="120" w:line="276"/>
+            </w:pPr>
+            <w:r>
+              <w:rPr>
+                <w:b/>
+                <w:bCs/>
+                <w:sz w:val="21"/>
+                <w:szCs w:val="21"/>
+              </w:rPr>
+              <w:t xml:space="preserve">Fase</w:t>
+            </w:r>
+          </w:p>
+        </w:tc>
+        <w:tc>
+          <w:tcPr>
+            <w:tcW w:type="dxa" w:w="6960"/>
+            <w:tcMar>
+              <w:top w:type="dxa" w:w="80"/>
+              <w:left w:type="dxa" w:w="120"/>
+              <w:bottom w:type="dxa" w:w="80"/>
+              <w:right w:type="dxa" w:w="120"/>
+            </w:tcMar>
+          </w:tcPr>
+          <w:p>
+            <w:pPr>
+              <w:spacing w:after="0" w:line="276"/>
+            </w:pPr>
+            <w:r>
+              <w:rPr>
+                <w:sz w:val="21"/>
+                <w:szCs w:val="21"/>
+              </w:rPr>
+              <w:t xml:space="preserve">Primer avance — documentación</w:t>
+            </w:r>
+          </w:p>
+        </w:tc>
+      </w:tr>
+      <w:tr>
+        <w:tc>
+          <w:tcPr>
+            <w:tcW w:type="dxa" w:w="2400"/>
+            <w:shd w:fill="F2F2F2" w:color="auto" w:val="clear"/>
+            <w:tcMar>
+              <w:top w:type="dxa" w:w="80"/>
+              <w:left w:type="dxa" w:w="120"/>
+              <w:bottom w:type="dxa" w:w="80"/>
+              <w:right w:type="dxa" w:w="120"/>
+            </w:tcMar>
+          </w:tcPr>
+          <w:p>
+            <w:pPr>
+              <w:spacing w:after="120" w:line="276"/>
+            </w:pPr>
+            <w:r>
+              <w:rPr>
+                <w:b/>
+                <w:bCs/>
+                <w:sz w:val="21"/>
+                <w:szCs w:val="21"/>
+              </w:rPr>
+              <w:t xml:space="preserve">Contexto</w:t>
+            </w:r>
+          </w:p>
+        </w:tc>
+        <w:tc>
+          <w:tcPr>
+            <w:tcW w:type="dxa" w:w="6960"/>
+            <w:tcMar>
+              <w:top w:type="dxa" w:w="80"/>
+              <w:left w:type="dxa" w:w="120"/>
+              <w:bottom w:type="dxa" w:w="80"/>
+              <w:right w:type="dxa" w:w="120"/>
+            </w:tcMar>
+          </w:tcPr>
+          <w:p>
+            <w:pPr>
+              <w:spacing w:after="0" w:line="276"/>
+            </w:pPr>
+            <w:r>
+              <w:rPr>
+                <w:sz w:val="21"/>
+                <w:szCs w:val="21"/>
+              </w:rPr>
+              <w:t xml:space="preserve">Se revisó el README para que un integrante pudiera instalar el proyecto desde cero sin apoyo del resto del equipo.</w:t>
+            </w:r>
+          </w:p>
+        </w:tc>
+      </w:tr>
+      <w:tr>
+        <w:tc>
+          <w:tcPr>
+            <w:tcW w:type="dxa" w:w="2400"/>
+            <w:shd w:fill="F2F2F2" w:color="auto" w:val="clear"/>
+            <w:tcMar>
+              <w:top w:type="dxa" w:w="80"/>
+              <w:left w:type="dxa" w:w="120"/>
+              <w:bottom w:type="dxa" w:w="80"/>
+              <w:right w:type="dxa" w:w="120"/>
+            </w:tcMar>
+          </w:tcPr>
+          <w:p>
+            <w:pPr>
+              <w:spacing w:after="120" w:line="276"/>
+            </w:pPr>
+            <w:r>
+              <w:rPr>
+                <w:b/>
+                <w:bCs/>
+                <w:sz w:val="21"/>
+                <w:szCs w:val="21"/>
+              </w:rPr>
+              <w:t xml:space="preserve">Defecto encontrado</w:t>
+            </w:r>
+          </w:p>
+        </w:tc>
+        <w:tc>
+          <w:tcPr>
+            <w:tcW w:type="dxa" w:w="6960"/>
+            <w:tcMar>
+              <w:top w:type="dxa" w:w="80"/>
+              <w:left w:type="dxa" w:w="120"/>
+              <w:bottom w:type="dxa" w:w="80"/>
+              <w:right w:type="dxa" w:w="120"/>
+            </w:tcMar>
+          </w:tcPr>
+          <w:p>
+            <w:pPr>
+              <w:spacing w:after="0" w:line="276"/>
+            </w:pPr>
+            <w:r>
+              <w:rPr>
+                <w:sz w:val="21"/>
+                <w:szCs w:val="21"/>
+              </w:rPr>
+              <w:t xml:space="preserve">El README indicaba crear la base con el nombre student_requests, mientras que el archivo .env.example apuntaba a gestion_academica_utn. Un integrante que siguiera el documento habría creado la base equivocada, y el error resultante (Unknown database) no señala la causa real.</w:t>
+            </w:r>
+          </w:p>
+        </w:tc>
+      </w:tr>
+      <w:tr>
+        <w:tc>
+          <w:tcPr>
+            <w:tcW w:type="dxa" w:w="2400"/>
+            <w:shd w:fill="F2F2F2" w:color="auto" w:val="clear"/>
+            <w:tcMar>
+              <w:top w:type="dxa" w:w="80"/>
+              <w:left w:type="dxa" w:w="120"/>
+              <w:bottom w:type="dxa" w:w="80"/>
+              <w:right w:type="dxa" w:w="120"/>
+            </w:tcMar>
+          </w:tcPr>
+          <w:p>
+            <w:pPr>
+              <w:spacing w:after="120" w:line="276"/>
+            </w:pPr>
+            <w:r>
+              <w:rPr>
+                <w:b/>
+                <w:bCs/>
+                <w:sz w:val="21"/>
+                <w:szCs w:val="21"/>
+              </w:rPr>
+              <w:t xml:space="preserve">Origen del defecto</w:t>
+            </w:r>
+          </w:p>
+        </w:tc>
+        <w:tc>
+          <w:tcPr>
+            <w:tcW w:type="dxa" w:w="6960"/>
+            <w:tcMar>
+              <w:top w:type="dxa" w:w="80"/>
+              <w:left w:type="dxa" w:w="120"/>
+              <w:bottom w:type="dxa" w:w="80"/>
+              <w:right w:type="dxa" w:w="120"/>
+            </w:tcMar>
+          </w:tcPr>
+          <w:p>
+            <w:pPr>
+              <w:spacing w:after="0" w:line="276"/>
+            </w:pPr>
+            <w:r>
+              <w:rPr>
+                <w:sz w:val="21"/>
+                <w:szCs w:val="21"/>
+              </w:rPr>
+              <w:t xml:space="preserve">El nombre se cambió al adoptar el estándar institucional (Entrada 12) pero el README conservó el valor anterior. Fue una omisión, no una decisión.</w:t>
+            </w:r>
+          </w:p>
+        </w:tc>
+      </w:tr>
+      <w:tr>
+        <w:tc>
+          <w:tcPr>
+            <w:tcW w:type="dxa" w:w="2400"/>
+            <w:shd w:fill="F2F2F2" w:color="auto" w:val="clear"/>
+            <w:tcMar>
+              <w:top w:type="dxa" w:w="80"/>
+              <w:left w:type="dxa" w:w="120"/>
+              <w:bottom w:type="dxa" w:w="80"/>
+              <w:right w:type="dxa" w:w="120"/>
+            </w:tcMar>
+          </w:tcPr>
+          <w:p>
+            <w:pPr>
+              <w:spacing w:after="120" w:line="276"/>
+            </w:pPr>
+            <w:r>
+              <w:rPr>
+                <w:b/>
+                <w:bCs/>
+                <w:sz w:val="21"/>
+                <w:szCs w:val="21"/>
+              </w:rPr>
+              <w:t xml:space="preserve">Otras correcciones</w:t>
+            </w:r>
+          </w:p>
+        </w:tc>
+        <w:tc>
+          <w:tcPr>
+            <w:tcW w:type="dxa" w:w="6960"/>
+            <w:tcMar>
+              <w:top w:type="dxa" w:w="80"/>
+              <w:left w:type="dxa" w:w="120"/>
+              <w:bottom w:type="dxa" w:w="80"/>
+              <w:right w:type="dxa" w:w="120"/>
+            </w:tcMar>
+          </w:tcPr>
+          <w:p>
+            <w:pPr>
+              <w:spacing w:after="0" w:line="276"/>
+            </w:pPr>
+            <w:r>
+              <w:rPr>
+                <w:sz w:val="21"/>
+                <w:szCs w:val="21"/>
+              </w:rPr>
+              <w:t xml:space="preserve">La tabla "Modelo de datos" conservaba los nombres en inglés previos a la Entrada 11; el ejemplo de flujo de Git referenciaba un archivo inexistente; el árbol del proyecto decía trece entidades cuando ya eran dieciocho. Se documentaron además las cuentas sembradas y qué criterio de aceptación demuestra cada una, que hasta ese momento no estaban en ninguna parte.</w:t>
+            </w:r>
+          </w:p>
+        </w:tc>
+      </w:tr>
+      <w:tr>
+        <w:tc>
+          <w:tcPr>
+            <w:tcW w:type="dxa" w:w="2400"/>
+            <w:shd w:fill="F2F2F2" w:color="auto" w:val="clear"/>
+            <w:tcMar>
+              <w:top w:type="dxa" w:w="80"/>
+              <w:left w:type="dxa" w:w="120"/>
+              <w:bottom w:type="dxa" w:w="80"/>
+              <w:right w:type="dxa" w:w="120"/>
+            </w:tcMar>
+          </w:tcPr>
+          <w:p>
+            <w:pPr>
+              <w:spacing w:after="120" w:line="276"/>
+            </w:pPr>
+            <w:r>
+              <w:rPr>
+                <w:b/>
+                <w:bCs/>
+                <w:sz w:val="21"/>
+                <w:szCs w:val="21"/>
+              </w:rPr>
+              <w:t xml:space="preserve">Aprendizaje</w:t>
+            </w:r>
+          </w:p>
+        </w:tc>
+        <w:tc>
+          <w:tcPr>
+            <w:tcW w:type="dxa" w:w="6960"/>
+            <w:tcMar>
+              <w:top w:type="dxa" w:w="80"/>
+              <w:left w:type="dxa" w:w="120"/>
+              <w:bottom w:type="dxa" w:w="80"/>
+              <w:right w:type="dxa" w:w="120"/>
+            </w:tcMar>
+          </w:tcPr>
+          <w:p>
+            <w:pPr>
+              <w:spacing w:after="0" w:line="276"/>
+            </w:pPr>
+            <w:r>
+              <w:rPr>
+                <w:sz w:val="21"/>
+                <w:szCs w:val="21"/>
+              </w:rPr>
+              <w:t xml:space="preserve">La documentación de instalación caduca en silencio: nada falla al escribirla y el error aparece semanas después, en la máquina de otra persona. Conviene revisarla cada vez que cambia un valor de configuración, no cuando alguien reporta el problema.</w:t>
+            </w:r>
+          </w:p>
+        </w:tc>
+      </w:tr>
+    </w:tbl>
+    <w:p>
+      <w:pPr>
+        <w:spacing w:after="200"/>
+      </w:pPr>
+    </w:p>
+    <w:p>
+      <w:pPr>
+        <w:pStyle w:val="Heading2"/>
+        <w:spacing w:after="140" w:before="280"/>
+      </w:pPr>
+      <w:r>
+        <w:rPr>
+          <w:b/>
+          <w:bCs/>
+          <w:color w:val="1F4E79"/>
+          <w:sz w:val="25"/>
+          <w:szCs w:val="25"/>
+        </w:rPr>
+        <w:t xml:space="preserve">Entrada 27 — Normativa institucional de idioma: reversión completa de la Entrada 11</w:t>
+      </w:r>
+    </w:p>
+    <w:tbl>
+      <w:tblPr>
+        <w:tblW w:type="dxa" w:w="9360"/>
+        <w:tblBorders>
+          <w:top w:val="single" w:color="auto" w:sz="4"/>
+          <w:left w:val="single" w:color="auto" w:sz="4"/>
+          <w:bottom w:val="single" w:color="auto" w:sz="4"/>
+          <w:right w:val="single" w:color="auto" w:sz="4"/>
+          <w:insideH w:val="single" w:color="auto" w:sz="4"/>
+          <w:insideV w:val="single" w:color="auto" w:sz="4"/>
+        </w:tblBorders>
+      </w:tblPr>
+      <w:tblGrid>
+        <w:gridCol w:w="2400"/>
+        <w:gridCol w:w="6960"/>
+      </w:tblGrid>
+      <w:tr>
+        <w:tc>
+          <w:tcPr>
+            <w:tcW w:type="dxa" w:w="2400"/>
+            <w:shd w:fill="F2F2F2" w:color="auto" w:val="clear"/>
+            <w:tcMar>
+              <w:top w:type="dxa" w:w="80"/>
+              <w:left w:type="dxa" w:w="120"/>
+              <w:bottom w:type="dxa" w:w="80"/>
+              <w:right w:type="dxa" w:w="120"/>
+            </w:tcMar>
+          </w:tcPr>
+          <w:p>
+            <w:pPr>
+              <w:spacing w:after="120" w:line="276"/>
+            </w:pPr>
+            <w:r>
+              <w:rPr>
+                <w:b/>
+                <w:bCs/>
+                <w:sz w:val="21"/>
+                <w:szCs w:val="21"/>
+              </w:rPr>
+              <w:t xml:space="preserve">Fecha</w:t>
+            </w:r>
+          </w:p>
+        </w:tc>
+        <w:tc>
+          <w:tcPr>
+            <w:tcW w:type="dxa" w:w="6960"/>
+            <w:tcMar>
+              <w:top w:type="dxa" w:w="80"/>
+              <w:left w:type="dxa" w:w="120"/>
+              <w:bottom w:type="dxa" w:w="80"/>
+              <w:right w:type="dxa" w:w="120"/>
+            </w:tcMar>
+          </w:tcPr>
+          <w:p>
+            <w:pPr>
+              <w:spacing w:after="0" w:line="276"/>
+            </w:pPr>
+            <w:r>
+              <w:rPr>
+                <w:sz w:val="21"/>
+                <w:szCs w:val="21"/>
+              </w:rPr>
+              <w:t xml:space="preserve">04/08/2026</w:t>
+            </w:r>
+          </w:p>
+        </w:tc>
+      </w:tr>
+      <w:tr>
+        <w:tc>
+          <w:tcPr>
+            <w:tcW w:type="dxa" w:w="2400"/>
+            <w:shd w:fill="F2F2F2" w:color="auto" w:val="clear"/>
+            <w:tcMar>
+              <w:top w:type="dxa" w:w="80"/>
+              <w:left w:type="dxa" w:w="120"/>
+              <w:bottom w:type="dxa" w:w="80"/>
+              <w:right w:type="dxa" w:w="120"/>
+            </w:tcMar>
+          </w:tcPr>
+          <w:p>
+            <w:pPr>
+              <w:spacing w:after="120" w:line="276"/>
+            </w:pPr>
+            <w:r>
+              <w:rPr>
+                <w:b/>
+                <w:bCs/>
+                <w:sz w:val="21"/>
+                <w:szCs w:val="21"/>
+              </w:rPr>
+              <w:t xml:space="preserve">Fase</w:t>
+            </w:r>
+          </w:p>
+        </w:tc>
+        <w:tc>
+          <w:tcPr>
+            <w:tcW w:type="dxa" w:w="6960"/>
+            <w:tcMar>
+              <w:top w:type="dxa" w:w="80"/>
+              <w:left w:type="dxa" w:w="120"/>
+              <w:bottom w:type="dxa" w:w="80"/>
+              <w:right w:type="dxa" w:w="120"/>
+            </w:tcMar>
+          </w:tcPr>
+          <w:p>
+            <w:pPr>
+              <w:spacing w:after="0" w:line="276"/>
+            </w:pPr>
+            <w:r>
+              <w:rPr>
+                <w:sz w:val="21"/>
+                <w:szCs w:val="21"/>
+              </w:rPr>
+              <w:t xml:space="preserve">Primer avance — modelo de datos</w:t>
+            </w:r>
+          </w:p>
+        </w:tc>
+      </w:tr>
+      <w:tr>
+        <w:tc>
+          <w:tcPr>
+            <w:tcW w:type="dxa" w:w="2400"/>
+            <w:shd w:fill="F2F2F2" w:color="auto" w:val="clear"/>
+            <w:tcMar>
+              <w:top w:type="dxa" w:w="80"/>
+              <w:left w:type="dxa" w:w="120"/>
+              <w:bottom w:type="dxa" w:w="80"/>
+              <w:right w:type="dxa" w:w="120"/>
+            </w:tcMar>
+          </w:tcPr>
+          <w:p>
+            <w:pPr>
+              <w:spacing w:after="120" w:line="276"/>
+            </w:pPr>
+            <w:r>
+              <w:rPr>
+                <w:b/>
+                <w:bCs/>
+                <w:sz w:val="21"/>
+                <w:szCs w:val="21"/>
+              </w:rPr>
+              <w:t xml:space="preserve">Contexto</w:t>
+            </w:r>
+          </w:p>
+        </w:tc>
+        <w:tc>
+          <w:tcPr>
+            <w:tcW w:type="dxa" w:w="6960"/>
+            <w:tcMar>
+              <w:top w:type="dxa" w:w="80"/>
+              <w:left w:type="dxa" w:w="120"/>
+              <w:bottom w:type="dxa" w:w="80"/>
+              <w:right w:type="dxa" w:w="120"/>
+            </w:tcMar>
+          </w:tcPr>
+          <w:p>
+            <w:pPr>
+              <w:spacing w:after="0" w:line="276"/>
+            </w:pPr>
+            <w:r>
+              <w:rPr>
+                <w:sz w:val="21"/>
+                <w:szCs w:val="21"/>
+              </w:rPr>
+              <w:t xml:space="preserve">Se confirmó que la normativa institucional exige que todo el proyecto esté en inglés. La Entrada 11 había resuelto lo contrario —español en tablas y modelos— por seguir el estándar del curso, que entonces estaba en español.</w:t>
+            </w:r>
+          </w:p>
+        </w:tc>
+      </w:tr>
+      <w:tr>
+        <w:tc>
+          <w:tcPr>
+            <w:tcW w:type="dxa" w:w="2400"/>
+            <w:shd w:fill="F2F2F2" w:color="auto" w:val="clear"/>
+            <w:tcMar>
+              <w:top w:type="dxa" w:w="80"/>
+              <w:left w:type="dxa" w:w="120"/>
+              <w:bottom w:type="dxa" w:w="80"/>
+              <w:right w:type="dxa" w:w="120"/>
+            </w:tcMar>
+          </w:tcPr>
+          <w:p>
+            <w:pPr>
+              <w:spacing w:after="120" w:line="276"/>
+            </w:pPr>
+            <w:r>
+              <w:rPr>
+                <w:b/>
+                <w:bCs/>
+                <w:sz w:val="21"/>
+                <w:szCs w:val="21"/>
+              </w:rPr>
+              <w:t xml:space="preserve">Consulta a la IA</w:t>
+            </w:r>
+          </w:p>
+        </w:tc>
+        <w:tc>
+          <w:tcPr>
+            <w:tcW w:type="dxa" w:w="6960"/>
+            <w:tcMar>
+              <w:top w:type="dxa" w:w="80"/>
+              <w:left w:type="dxa" w:w="120"/>
+              <w:bottom w:type="dxa" w:w="80"/>
+              <w:right w:type="dxa" w:w="120"/>
+            </w:tcMar>
+          </w:tcPr>
+          <w:p>
+            <w:pPr>
+              <w:spacing w:after="0" w:line="276"/>
+            </w:pPr>
+            <w:r>
+              <w:rPr>
+                <w:sz w:val="21"/>
+                <w:szCs w:val="21"/>
+              </w:rPr>
+              <w:t xml:space="preserve">Se preguntó si el cambio era viable y qué había que borrar. La respuesta separó el problema en dos: los nombres de clase podían pasar a inglés sin tocar la base, pero renombrar las tablas rompía la correspondencia con el estándar del docente.</w:t>
+            </w:r>
+          </w:p>
+        </w:tc>
+      </w:tr>
+      <w:tr>
+        <w:tc>
+          <w:tcPr>
+            <w:tcW w:type="dxa" w:w="2400"/>
+            <w:shd w:fill="F2F2F2" w:color="auto" w:val="clear"/>
+            <w:tcMar>
+              <w:top w:type="dxa" w:w="80"/>
+              <w:left w:type="dxa" w:w="120"/>
+              <w:bottom w:type="dxa" w:w="80"/>
+              <w:right w:type="dxa" w:w="120"/>
+            </w:tcMar>
+          </w:tcPr>
+          <w:p>
+            <w:pPr>
+              <w:spacing w:after="120" w:line="276"/>
+            </w:pPr>
+            <w:r>
+              <w:rPr>
+                <w:b/>
+                <w:bCs/>
+                <w:sz w:val="21"/>
+                <w:szCs w:val="21"/>
+              </w:rPr>
+              <w:t xml:space="preserve">Qué se rechazó de la IA</w:t>
+            </w:r>
+          </w:p>
+        </w:tc>
+        <w:tc>
+          <w:tcPr>
+            <w:tcW w:type="dxa" w:w="6960"/>
+            <w:tcMar>
+              <w:top w:type="dxa" w:w="80"/>
+              <w:left w:type="dxa" w:w="120"/>
+              <w:bottom w:type="dxa" w:w="80"/>
+              <w:right w:type="dxa" w:w="120"/>
+            </w:tcMar>
+          </w:tcPr>
+          <w:p>
+            <w:pPr>
+              <w:spacing w:after="0" w:line="276"/>
+            </w:pPr>
+            <w:r>
+              <w:rPr>
+                <w:sz w:val="21"/>
+                <w:szCs w:val="21"/>
+              </w:rPr>
+              <w:t xml:space="preserve">La recomendación de no hacerlo. La IA argumentó que sería el tercer cambio de criterio sobre el mismo punto y que traducir el lenguaje del dominio contradice el principio de lenguaje ubicuo de DDD. Ambos argumentos son válidos, pero ninguno pesa frente a una normativa institucional: no era una preferencia del equipo sino un requisito externo.</w:t>
+            </w:r>
+          </w:p>
+        </w:tc>
+      </w:tr>
+      <w:tr>
+        <w:tc>
+          <w:tcPr>
+            <w:tcW w:type="dxa" w:w="2400"/>
+            <w:shd w:fill="F2F2F2" w:color="auto" w:val="clear"/>
+            <w:tcMar>
+              <w:top w:type="dxa" w:w="80"/>
+              <w:left w:type="dxa" w:w="120"/>
+              <w:bottom w:type="dxa" w:w="80"/>
+              <w:right w:type="dxa" w:w="120"/>
+            </w:tcMar>
+          </w:tcPr>
+          <w:p>
+            <w:pPr>
+              <w:spacing w:after="120" w:line="276"/>
+            </w:pPr>
+            <w:r>
+              <w:rPr>
+                <w:b/>
+                <w:bCs/>
+                <w:sz w:val="21"/>
+                <w:szCs w:val="21"/>
+              </w:rPr>
+              <w:t xml:space="preserve">Resolución del conflicto</w:t>
+            </w:r>
+          </w:p>
+        </w:tc>
+        <w:tc>
+          <w:tcPr>
+            <w:tcW w:type="dxa" w:w="6960"/>
+            <w:tcMar>
+              <w:top w:type="dxa" w:w="80"/>
+              <w:left w:type="dxa" w:w="120"/>
+              <w:bottom w:type="dxa" w:w="80"/>
+              <w:right w:type="dxa" w:w="120"/>
+            </w:tcMar>
+          </w:tcPr>
+          <w:p>
+            <w:pPr>
+              <w:spacing w:after="0" w:line="276"/>
+            </w:pPr>
+            <w:r>
+              <w:rPr>
+                <w:sz w:val="21"/>
+                <w:szCs w:val="21"/>
+              </w:rPr>
+              <w:t xml:space="preserve">El docente entregó el estándar traducido (utn_academic_management_system.sql), lo que eliminó la objeción de fondo: al cambiar el estándar, seguirlo en inglés dejó de ser una divergencia y pasó a ser lo contrario.</w:t>
+            </w:r>
+          </w:p>
+        </w:tc>
+      </w:tr>
+      <w:tr>
+        <w:tc>
+          <w:tcPr>
+            <w:tcW w:type="dxa" w:w="2400"/>
+            <w:shd w:fill="F2F2F2" w:color="auto" w:val="clear"/>
+            <w:tcMar>
+              <w:top w:type="dxa" w:w="80"/>
+              <w:left w:type="dxa" w:w="120"/>
+              <w:bottom w:type="dxa" w:w="80"/>
+              <w:right w:type="dxa" w:w="120"/>
+            </w:tcMar>
+          </w:tcPr>
+          <w:p>
+            <w:pPr>
+              <w:spacing w:after="120" w:line="276"/>
+            </w:pPr>
+            <w:r>
+              <w:rPr>
+                <w:b/>
+                <w:bCs/>
+                <w:sz w:val="21"/>
+                <w:szCs w:val="21"/>
+              </w:rPr>
+              <w:t xml:space="preserve">Alcance del cambio</w:t>
+            </w:r>
+          </w:p>
+        </w:tc>
+        <w:tc>
+          <w:tcPr>
+            <w:tcW w:type="dxa" w:w="6960"/>
+            <w:tcMar>
+              <w:top w:type="dxa" w:w="80"/>
+              <w:left w:type="dxa" w:w="120"/>
+              <w:bottom w:type="dxa" w:w="80"/>
+              <w:right w:type="dxa" w:w="120"/>
+            </w:tcMar>
+          </w:tcPr>
+          <w:p>
+            <w:pPr>
+              <w:spacing w:after="0" w:line="276"/>
+            </w:pPr>
+            <w:r>
+              <w:rPr>
+                <w:sz w:val="21"/>
+                <w:szCs w:val="21"/>
+              </w:rPr>
+              <w:t xml:space="preserve">Se reescribieron las veinticuatro migraciones, los dieciocho modelos, las dieciocho factories y los nueve seeders. Cambió también el nombre de la base de datos, de gestion_academica_utn a utn_academic_management, con la actualización correspondiente en .env.example y en el README.</w:t>
+            </w:r>
+          </w:p>
+        </w:tc>
+      </w:tr>
+      <w:tr>
+        <w:tc>
+          <w:tcPr>
+            <w:tcW w:type="dxa" w:w="2400"/>
+            <w:shd w:fill="F2F2F2" w:color="auto" w:val="clear"/>
+            <w:tcMar>
+              <w:top w:type="dxa" w:w="80"/>
+              <w:left w:type="dxa" w:w="120"/>
+              <w:bottom w:type="dxa" w:w="80"/>
+              <w:right w:type="dxa" w:w="120"/>
+            </w:tcMar>
+          </w:tcPr>
+          <w:p>
+            <w:pPr>
+              <w:spacing w:after="120" w:line="276"/>
+            </w:pPr>
+            <w:r>
+              <w:rPr>
+                <w:b/>
+                <w:bCs/>
+                <w:sz w:val="21"/>
+                <w:szCs w:val="21"/>
+              </w:rPr>
+              <w:t xml:space="preserve">Qué NO se tradujo, y por qué</w:t>
+            </w:r>
+          </w:p>
+        </w:tc>
+        <w:tc>
+          <w:tcPr>
+            <w:tcW w:type="dxa" w:w="6960"/>
+            <w:tcMar>
+              <w:top w:type="dxa" w:w="80"/>
+              <w:left w:type="dxa" w:w="120"/>
+              <w:bottom w:type="dxa" w:w="80"/>
+              <w:right w:type="dxa" w:w="120"/>
+            </w:tcMar>
+          </w:tcPr>
+          <w:p>
+            <w:pPr>
+              <w:spacing w:after="120" w:line="276"/>
+            </w:pPr>
+            <w:r>
+              <w:rPr>
+                <w:sz w:val="21"/>
+                <w:szCs w:val="21"/>
+              </w:rPr>
+              <w:t xml:space="preserve">Los valores de los ENUM se conservan en español: "Convalidación", "Pendiente de revisión", "Requisito levantado". Son datos definidos por el estándar, no identificadores; traducirlos rompería la compatibilidad con la base.</w:t>
+            </w:r>
+          </w:p>
+          <w:p>
+            <w:pPr>
+              <w:spacing w:after="120" w:line="276"/>
+            </w:pPr>
+            <w:r>
+              <w:rPr>
+                <w:sz w:val="21"/>
+                <w:szCs w:val="21"/>
+              </w:rPr>
+              <w:t xml:space="preserve">Los nombres de rol se conservan igual, por la misma razón: "Coordinadora de Docencia", "Comisión Técnica".</w:t>
+            </w:r>
+          </w:p>
+          <w:p>
+            <w:pPr>
+              <w:spacing w:after="0" w:line="276"/>
+            </w:pPr>
+            <w:r>
+              <w:rPr>
+                <w:sz w:val="21"/>
+                <w:szCs w:val="21"/>
+              </w:rPr>
+              <w:t xml:space="preserve">Las constantes que envuelven esos valores sí son inglesas, de modo que el código no repite cadenas en español: StudentRequest::TYPE_TRANSFER_CREDIT contiene el valor "Convalidación".</w:t>
+            </w:r>
+          </w:p>
+        </w:tc>
+      </w:tr>
+      <w:tr>
+        <w:tc>
+          <w:tcPr>
+            <w:tcW w:type="dxa" w:w="2400"/>
+            <w:shd w:fill="F2F2F2" w:color="auto" w:val="clear"/>
+            <w:tcMar>
+              <w:top w:type="dxa" w:w="80"/>
+              <w:left w:type="dxa" w:w="120"/>
+              <w:bottom w:type="dxa" w:w="80"/>
+              <w:right w:type="dxa" w:w="120"/>
+            </w:tcMar>
+          </w:tcPr>
+          <w:p>
+            <w:pPr>
+              <w:spacing w:after="120" w:line="276"/>
+            </w:pPr>
+            <w:r>
+              <w:rPr>
+                <w:b/>
+                <w:bCs/>
+                <w:sz w:val="21"/>
+                <w:szCs w:val="21"/>
+              </w:rPr>
+              <w:t xml:space="preserve">Efecto no previsto</w:t>
+            </w:r>
+          </w:p>
+        </w:tc>
+        <w:tc>
+          <w:tcPr>
+            <w:tcW w:type="dxa" w:w="6960"/>
+            <w:tcMar>
+              <w:top w:type="dxa" w:w="80"/>
+              <w:left w:type="dxa" w:w="120"/>
+              <w:bottom w:type="dxa" w:w="80"/>
+              <w:right w:type="dxa" w:w="120"/>
+            </w:tcMar>
+          </w:tcPr>
+          <w:p>
+            <w:pPr>
+              <w:spacing w:after="0" w:line="276"/>
+            </w:pPr>
+            <w:r>
+              <w:rPr>
+                <w:sz w:val="21"/>
+                <w:szCs w:val="21"/>
+              </w:rPr>
+              <w:t xml:space="preserve">Con los nombres en inglés el pluralizador de Laravel resuelve correctamente diecisiete de los dieciocho modelos. Antes eran diez los que necesitaban el atributo #[Table]; ahora solo StudentRequestStatusHistory, que resolvería student_request_status_histories. El problema descrito en las Entradas 11 y 22 desapareció casi por completo como consecuencia lateral del cambio de idioma.</w:t>
+            </w:r>
+          </w:p>
+        </w:tc>
+      </w:tr>
+      <w:tr>
+        <w:tc>
+          <w:tcPr>
+            <w:tcW w:type="dxa" w:w="2400"/>
+            <w:shd w:fill="F2F2F2" w:color="auto" w:val="clear"/>
+            <w:tcMar>
+              <w:top w:type="dxa" w:w="80"/>
+              <w:left w:type="dxa" w:w="120"/>
+              <w:bottom w:type="dxa" w:w="80"/>
+              <w:right w:type="dxa" w:w="120"/>
+            </w:tcMar>
+          </w:tcPr>
+          <w:p>
+            <w:pPr>
+              <w:spacing w:after="120" w:line="276"/>
+            </w:pPr>
+            <w:r>
+              <w:rPr>
+                <w:b/>
+                <w:bCs/>
+                <w:sz w:val="21"/>
+                <w:szCs w:val="21"/>
+              </w:rPr>
+              <w:t xml:space="preserve">Aprendizaje</w:t>
+            </w:r>
+          </w:p>
+        </w:tc>
+        <w:tc>
+          <w:tcPr>
+            <w:tcW w:type="dxa" w:w="6960"/>
+            <w:tcMar>
+              <w:top w:type="dxa" w:w="80"/>
+              <w:left w:type="dxa" w:w="120"/>
+              <w:bottom w:type="dxa" w:w="80"/>
+              <w:right w:type="dxa" w:w="120"/>
+            </w:tcMar>
+          </w:tcPr>
+          <w:p>
+            <w:pPr>
+              <w:spacing w:after="0" w:line="276"/>
+            </w:pPr>
+            <w:r>
+              <w:rPr>
+                <w:sz w:val="21"/>
+                <w:szCs w:val="21"/>
+              </w:rPr>
+              <w:t xml:space="preserve">Una decisión de equipo bien argumentada puede quedar sin efecto por una restricción externa que no estaba sobre la mesa cuando se tomó. El registro de las Entradas 03, 11 y 27 no muestra indecisión sino tres contextos distintos: preferencia propia, estándar en español, normativa institucional. Documentar el motivo de cada reversa es lo que distingue un cambio de criterio de un cambio de circunstancias.</w:t>
+            </w:r>
+          </w:p>
+        </w:tc>
+      </w:tr>
+    </w:tbl>
+    <w:p>
+      <w:pPr>
+        <w:spacing w:after="200"/>
+      </w:pPr>
+    </w:p>
+    <w:p>
+      <w:pPr>
+        <w:pStyle w:val="Heading2"/>
+        <w:spacing w:after="140" w:before="280"/>
+      </w:pPr>
+      <w:r>
+        <w:rPr>
+          <w:b/>
+          <w:bCs/>
+          <w:color w:val="1F4E79"/>
+          <w:sz w:val="25"/>
+          <w:szCs w:val="25"/>
+        </w:rPr>
+        <w:t xml:space="preserve">Entrada 28 — El estándar traducido incorpora correcciones, no solo cambio de idioma</w:t>
+      </w:r>
+    </w:p>
+    <w:tbl>
+      <w:tblPr>
+        <w:tblW w:type="dxa" w:w="9360"/>
+        <w:tblBorders>
+          <w:top w:val="single" w:color="auto" w:sz="4"/>
+          <w:left w:val="single" w:color="auto" w:sz="4"/>
+          <w:bottom w:val="single" w:color="auto" w:sz="4"/>
+          <w:right w:val="single" w:color="auto" w:sz="4"/>
+          <w:insideH w:val="single" w:color="auto" w:sz="4"/>
+          <w:insideV w:val="single" w:color="auto" w:sz="4"/>
+        </w:tblBorders>
+      </w:tblPr>
+      <w:tblGrid>
+        <w:gridCol w:w="2400"/>
+        <w:gridCol w:w="6960"/>
+      </w:tblGrid>
+      <w:tr>
+        <w:tc>
+          <w:tcPr>
+            <w:tcW w:type="dxa" w:w="2400"/>
+            <w:shd w:fill="F2F2F2" w:color="auto" w:val="clear"/>
+            <w:tcMar>
+              <w:top w:type="dxa" w:w="80"/>
+              <w:left w:type="dxa" w:w="120"/>
+              <w:bottom w:type="dxa" w:w="80"/>
+              <w:right w:type="dxa" w:w="120"/>
+            </w:tcMar>
+          </w:tcPr>
+          <w:p>
+            <w:pPr>
+              <w:spacing w:after="120" w:line="276"/>
+            </w:pPr>
+            <w:r>
+              <w:rPr>
+                <w:b/>
+                <w:bCs/>
+                <w:sz w:val="21"/>
+                <w:szCs w:val="21"/>
+              </w:rPr>
+              <w:t xml:space="preserve">Fecha</w:t>
+            </w:r>
+          </w:p>
+        </w:tc>
+        <w:tc>
+          <w:tcPr>
+            <w:tcW w:type="dxa" w:w="6960"/>
+            <w:tcMar>
+              <w:top w:type="dxa" w:w="80"/>
+              <w:left w:type="dxa" w:w="120"/>
+              <w:bottom w:type="dxa" w:w="80"/>
+              <w:right w:type="dxa" w:w="120"/>
+            </w:tcMar>
+          </w:tcPr>
+          <w:p>
+            <w:pPr>
+              <w:spacing w:after="0" w:line="276"/>
+            </w:pPr>
+            <w:r>
+              <w:rPr>
+                <w:sz w:val="21"/>
+                <w:szCs w:val="21"/>
+              </w:rPr>
+              <w:t xml:space="preserve">04/08/2026</w:t>
+            </w:r>
+          </w:p>
+        </w:tc>
+      </w:tr>
+      <w:tr>
+        <w:tc>
+          <w:tcPr>
+            <w:tcW w:type="dxa" w:w="2400"/>
+            <w:shd w:fill="F2F2F2" w:color="auto" w:val="clear"/>
+            <w:tcMar>
+              <w:top w:type="dxa" w:w="80"/>
+              <w:left w:type="dxa" w:w="120"/>
+              <w:bottom w:type="dxa" w:w="80"/>
+              <w:right w:type="dxa" w:w="120"/>
+            </w:tcMar>
+          </w:tcPr>
+          <w:p>
+            <w:pPr>
+              <w:spacing w:after="120" w:line="276"/>
+            </w:pPr>
+            <w:r>
+              <w:rPr>
+                <w:b/>
+                <w:bCs/>
+                <w:sz w:val="21"/>
+                <w:szCs w:val="21"/>
+              </w:rPr>
+              <w:t xml:space="preserve">Fase</w:t>
+            </w:r>
+          </w:p>
+        </w:tc>
+        <w:tc>
+          <w:tcPr>
+            <w:tcW w:type="dxa" w:w="6960"/>
+            <w:tcMar>
+              <w:top w:type="dxa" w:w="80"/>
+              <w:left w:type="dxa" w:w="120"/>
+              <w:bottom w:type="dxa" w:w="80"/>
+              <w:right w:type="dxa" w:w="120"/>
+            </w:tcMar>
+          </w:tcPr>
+          <w:p>
+            <w:pPr>
+              <w:spacing w:after="0" w:line="276"/>
+            </w:pPr>
+            <w:r>
+              <w:rPr>
+                <w:sz w:val="21"/>
+                <w:szCs w:val="21"/>
+              </w:rPr>
+              <w:t xml:space="preserve">Primer avance — modelo de datos</w:t>
+            </w:r>
+          </w:p>
+        </w:tc>
+      </w:tr>
+      <w:tr>
+        <w:tc>
+          <w:tcPr>
+            <w:tcW w:type="dxa" w:w="2400"/>
+            <w:shd w:fill="F2F2F2" w:color="auto" w:val="clear"/>
+            <w:tcMar>
+              <w:top w:type="dxa" w:w="80"/>
+              <w:left w:type="dxa" w:w="120"/>
+              <w:bottom w:type="dxa" w:w="80"/>
+              <w:right w:type="dxa" w:w="120"/>
+            </w:tcMar>
+          </w:tcPr>
+          <w:p>
+            <w:pPr>
+              <w:spacing w:after="120" w:line="276"/>
+            </w:pPr>
+            <w:r>
+              <w:rPr>
+                <w:b/>
+                <w:bCs/>
+                <w:sz w:val="21"/>
+                <w:szCs w:val="21"/>
+              </w:rPr>
+              <w:t xml:space="preserve">Contexto</w:t>
+            </w:r>
+          </w:p>
+        </w:tc>
+        <w:tc>
+          <w:tcPr>
+            <w:tcW w:type="dxa" w:w="6960"/>
+            <w:tcMar>
+              <w:top w:type="dxa" w:w="80"/>
+              <w:left w:type="dxa" w:w="120"/>
+              <w:bottom w:type="dxa" w:w="80"/>
+              <w:right w:type="dxa" w:w="120"/>
+            </w:tcMar>
+          </w:tcPr>
+          <w:p>
+            <w:pPr>
+              <w:spacing w:after="0" w:line="276"/>
+            </w:pPr>
+            <w:r>
+              <w:rPr>
+                <w:sz w:val="21"/>
+                <w:szCs w:val="21"/>
+              </w:rPr>
+              <w:t xml:space="preserve">Antes de transcribir el estándar en inglés se contrastó contra la versión en español, bajo el supuesto de que sería una traducción literal. No lo era.</w:t>
+            </w:r>
+          </w:p>
+        </w:tc>
+      </w:tr>
+      <w:tr>
+        <w:tc>
+          <w:tcPr>
+            <w:tcW w:type="dxa" w:w="2400"/>
+            <w:shd w:fill="F2F2F2" w:color="auto" w:val="clear"/>
+            <w:tcMar>
+              <w:top w:type="dxa" w:w="80"/>
+              <w:left w:type="dxa" w:w="120"/>
+              <w:bottom w:type="dxa" w:w="80"/>
+              <w:right w:type="dxa" w:w="120"/>
+            </w:tcMar>
+          </w:tcPr>
+          <w:p>
+            <w:pPr>
+              <w:spacing w:after="120" w:line="276"/>
+            </w:pPr>
+            <w:r>
+              <w:rPr>
+                <w:b/>
+                <w:bCs/>
+                <w:sz w:val="21"/>
+                <w:szCs w:val="21"/>
+              </w:rPr>
+              <w:t xml:space="preserve">Hallazgo</w:t>
+            </w:r>
+          </w:p>
+        </w:tc>
+        <w:tc>
+          <w:tcPr>
+            <w:tcW w:type="dxa" w:w="6960"/>
+            <w:tcMar>
+              <w:top w:type="dxa" w:w="80"/>
+              <w:left w:type="dxa" w:w="120"/>
+              <w:bottom w:type="dxa" w:w="80"/>
+              <w:right w:type="dxa" w:w="120"/>
+            </w:tcMar>
+          </w:tcPr>
+          <w:p>
+            <w:pPr>
+              <w:spacing w:after="0" w:line="276"/>
+            </w:pPr>
+            <w:r>
+              <w:rPr>
+                <w:sz w:val="21"/>
+                <w:szCs w:val="21"/>
+              </w:rPr>
+              <w:t xml:space="preserve">El nuevo script incorpora siete restricciones CHECK que no existían en la versión anterior. Transcribirlo sin auditarlo habría dejado la base más permisiva que el estándar.</w:t>
+            </w:r>
+          </w:p>
+        </w:tc>
+      </w:tr>
+      <w:tr>
+        <w:tc>
+          <w:tcPr>
+            <w:tcW w:type="dxa" w:w="2400"/>
+            <w:shd w:fill="F2F2F2" w:color="auto" w:val="clear"/>
+            <w:tcMar>
+              <w:top w:type="dxa" w:w="80"/>
+              <w:left w:type="dxa" w:w="120"/>
+              <w:bottom w:type="dxa" w:w="80"/>
+              <w:right w:type="dxa" w:w="120"/>
+            </w:tcMar>
+          </w:tcPr>
+          <w:p>
+            <w:pPr>
+              <w:spacing w:after="120" w:line="276"/>
+            </w:pPr>
+            <w:r>
+              <w:rPr>
+                <w:b/>
+                <w:bCs/>
+                <w:sz w:val="21"/>
+                <w:szCs w:val="21"/>
+              </w:rPr>
+              <w:t xml:space="preserve">Restricciones nuevas</w:t>
+            </w:r>
+          </w:p>
+        </w:tc>
+        <w:tc>
+          <w:tcPr>
+            <w:tcW w:type="dxa" w:w="6960"/>
+            <w:tcMar>
+              <w:top w:type="dxa" w:w="80"/>
+              <w:left w:type="dxa" w:w="120"/>
+              <w:bottom w:type="dxa" w:w="80"/>
+              <w:right w:type="dxa" w:w="120"/>
+            </w:tcMar>
+          </w:tcPr>
+          <w:p>
+            <w:pPr>
+              <w:spacing w:after="120" w:line="276"/>
+            </w:pPr>
+            <w:r>
+              <w:rPr>
+                <w:sz w:val="21"/>
+                <w:szCs w:val="21"/>
+              </w:rPr>
+              <w:t xml:space="preserve">chk_waiver_rules_parameters: cada tipo de regla debe llevar exactamente sus parámetros y ninguno de los otros.</w:t>
+            </w:r>
+          </w:p>
+          <w:p>
+            <w:pPr>
+              <w:spacing w:after="120" w:line="276"/>
+            </w:pPr>
+            <w:r>
+              <w:rPr>
+                <w:sz w:val="21"/>
+                <w:szCs w:val="21"/>
+              </w:rPr>
+              <w:t xml:space="preserve">chk_student_requests_waiver_fields y chk_student_requests_transfer_fields: cada tipo de solicitud con sus campos obligatorios.</w:t>
+            </w:r>
+          </w:p>
+          <w:p>
+            <w:pPr>
+              <w:spacing w:after="120" w:line="276"/>
+            </w:pPr>
+            <w:r>
+              <w:rPr>
+                <w:sz w:val="21"/>
+                <w:szCs w:val="21"/>
+              </w:rPr>
+              <w:t xml:space="preserve">chk_courses_lab_type: un curso que requiere laboratorio debe indicar cuál, y uno que no lo requiere no debe indicar ninguno.</w:t>
+            </w:r>
+          </w:p>
+          <w:p>
+            <w:pPr>
+              <w:spacing w:after="120" w:line="276"/>
+            </w:pPr>
+            <w:r>
+              <w:rPr>
+                <w:sz w:val="21"/>
+                <w:szCs w:val="21"/>
+              </w:rPr>
+              <w:t xml:space="preserve">chk_course_equivalences_superseded: una equiparación sustituida debe apuntar a la que la reemplaza; una vigente, a ninguna.</w:t>
+            </w:r>
+          </w:p>
+          <w:p>
+            <w:pPr>
+              <w:spacing w:after="120" w:line="276"/>
+            </w:pPr>
+            <w:r>
+              <w:rPr>
+                <w:sz w:val="21"/>
+                <w:szCs w:val="21"/>
+              </w:rPr>
+              <w:t xml:space="preserve">chk_academic_records_grade: la nota, si existe, queda entre 0 y 100.</w:t>
+            </w:r>
+          </w:p>
+          <w:p>
+            <w:pPr>
+              <w:spacing w:after="0" w:line="276"/>
+            </w:pPr>
+            <w:r>
+              <w:rPr>
+                <w:sz w:val="21"/>
+                <w:szCs w:val="21"/>
+              </w:rPr>
+              <w:t xml:space="preserve">chk_levels_number y chk_course_level_credits: ambos valores deben ser mayores que cero.</w:t>
+            </w:r>
+          </w:p>
+        </w:tc>
+      </w:tr>
+      <w:tr>
+        <w:tc>
+          <w:tcPr>
+            <w:tcW w:type="dxa" w:w="2400"/>
+            <w:shd w:fill="F2F2F2" w:color="auto" w:val="clear"/>
+            <w:tcMar>
+              <w:top w:type="dxa" w:w="80"/>
+              <w:left w:type="dxa" w:w="120"/>
+              <w:bottom w:type="dxa" w:w="80"/>
+              <w:right w:type="dxa" w:w="120"/>
+            </w:tcMar>
+          </w:tcPr>
+          <w:p>
+            <w:pPr>
+              <w:spacing w:after="120" w:line="276"/>
+            </w:pPr>
+            <w:r>
+              <w:rPr>
+                <w:b/>
+                <w:bCs/>
+                <w:sz w:val="21"/>
+                <w:szCs w:val="21"/>
+              </w:rPr>
+              <w:t xml:space="preserve">Consecuencia sobre las factories</w:t>
+            </w:r>
+          </w:p>
+        </w:tc>
+        <w:tc>
+          <w:tcPr>
+            <w:tcW w:type="dxa" w:w="6960"/>
+            <w:tcMar>
+              <w:top w:type="dxa" w:w="80"/>
+              <w:left w:type="dxa" w:w="120"/>
+              <w:bottom w:type="dxa" w:w="80"/>
+              <w:right w:type="dxa" w:w="120"/>
+            </w:tcMar>
+          </w:tcPr>
+          <w:p>
+            <w:pPr>
+              <w:spacing w:after="0" w:line="276"/>
+            </w:pPr>
+            <w:r>
+              <w:rPr>
+                <w:sz w:val="21"/>
+                <w:szCs w:val="21"/>
+              </w:rPr>
+              <w:t xml:space="preserve">chk_waiver_rules_parameters obligó a rediseñar WaiverRuleFactory: cada estado nombrado debe anular explícitamente los parámetros que no corresponden a su tipo, o el INSERT es rechazado por la base. Antes bastaba con asignar los que sí aplicaban.</w:t>
+            </w:r>
+          </w:p>
+        </w:tc>
+      </w:tr>
+      <w:tr>
+        <w:tc>
+          <w:tcPr>
+            <w:tcW w:type="dxa" w:w="2400"/>
+            <w:shd w:fill="F2F2F2" w:color="auto" w:val="clear"/>
+            <w:tcMar>
+              <w:top w:type="dxa" w:w="80"/>
+              <w:left w:type="dxa" w:w="120"/>
+              <w:bottom w:type="dxa" w:w="80"/>
+              <w:right w:type="dxa" w:w="120"/>
+            </w:tcMar>
+          </w:tcPr>
+          <w:p>
+            <w:pPr>
+              <w:spacing w:after="120" w:line="276"/>
+            </w:pPr>
+            <w:r>
+              <w:rPr>
+                <w:b/>
+                <w:bCs/>
+                <w:sz w:val="21"/>
+                <w:szCs w:val="21"/>
+              </w:rPr>
+              <w:t xml:space="preserve">Observación registrada</w:t>
+            </w:r>
+          </w:p>
+        </w:tc>
+        <w:tc>
+          <w:tcPr>
+            <w:tcW w:type="dxa" w:w="6960"/>
+            <w:tcMar>
+              <w:top w:type="dxa" w:w="80"/>
+              <w:left w:type="dxa" w:w="120"/>
+              <w:bottom w:type="dxa" w:w="80"/>
+              <w:right w:type="dxa" w:w="120"/>
+            </w:tcMar>
+          </w:tcPr>
+          <w:p>
+            <w:pPr>
+              <w:spacing w:after="0" w:line="276"/>
+            </w:pPr>
+            <w:r>
+              <w:rPr>
+                <w:sz w:val="21"/>
+                <w:szCs w:val="21"/>
+              </w:rPr>
+              <w:t xml:space="preserve">La restricción de unicidad sobre transfer_credit_precedents, señalada como Observación 4 de la Entrada 20, sigue ausente. Las otras tres observaciones de esa entrada tampoco fueron atendidas. Se mantienen como consultas abiertas.</w:t>
+            </w:r>
+          </w:p>
+        </w:tc>
+      </w:tr>
+      <w:tr>
+        <w:tc>
+          <w:tcPr>
+            <w:tcW w:type="dxa" w:w="2400"/>
+            <w:shd w:fill="F2F2F2" w:color="auto" w:val="clear"/>
+            <w:tcMar>
+              <w:top w:type="dxa" w:w="80"/>
+              <w:left w:type="dxa" w:w="120"/>
+              <w:bottom w:type="dxa" w:w="80"/>
+              <w:right w:type="dxa" w:w="120"/>
+            </w:tcMar>
+          </w:tcPr>
+          <w:p>
+            <w:pPr>
+              <w:spacing w:after="120" w:line="276"/>
+            </w:pPr>
+            <w:r>
+              <w:rPr>
+                <w:b/>
+                <w:bCs/>
+                <w:sz w:val="21"/>
+                <w:szCs w:val="21"/>
+              </w:rPr>
+              <w:t xml:space="preserve">Verificación aplicada</w:t>
+            </w:r>
+          </w:p>
+        </w:tc>
+        <w:tc>
+          <w:tcPr>
+            <w:tcW w:type="dxa" w:w="6960"/>
+            <w:tcMar>
+              <w:top w:type="dxa" w:w="80"/>
+              <w:left w:type="dxa" w:w="120"/>
+              <w:bottom w:type="dxa" w:w="80"/>
+              <w:right w:type="dxa" w:w="120"/>
+            </w:tcMar>
+          </w:tcPr>
+          <w:p>
+            <w:pPr>
+              <w:spacing w:after="0" w:line="276"/>
+            </w:pPr>
+            <w:r>
+              <w:rPr>
+                <w:sz w:val="21"/>
+                <w:szCs w:val="21"/>
+              </w:rPr>
+              <w:t xml:space="preserve">Se contrastaron las veinticinco tablas columna por columna contra el script, y los ciento siete nombres de índice, clave foránea y restricción CHECK: coinciden exactamente, sin faltantes ni sobrantes.</w:t>
+            </w:r>
+          </w:p>
+        </w:tc>
+      </w:tr>
+      <w:tr>
+        <w:tc>
+          <w:tcPr>
+            <w:tcW w:type="dxa" w:w="2400"/>
+            <w:shd w:fill="F2F2F2" w:color="auto" w:val="clear"/>
+            <w:tcMar>
+              <w:top w:type="dxa" w:w="80"/>
+              <w:left w:type="dxa" w:w="120"/>
+              <w:bottom w:type="dxa" w:w="80"/>
+              <w:right w:type="dxa" w:w="120"/>
+            </w:tcMar>
+          </w:tcPr>
+          <w:p>
+            <w:pPr>
+              <w:spacing w:after="120" w:line="276"/>
+            </w:pPr>
+            <w:r>
+              <w:rPr>
+                <w:b/>
+                <w:bCs/>
+                <w:sz w:val="21"/>
+                <w:szCs w:val="21"/>
+              </w:rPr>
+              <w:t xml:space="preserve">Aprendizaje</w:t>
+            </w:r>
+          </w:p>
+        </w:tc>
+        <w:tc>
+          <w:tcPr>
+            <w:tcW w:type="dxa" w:w="6960"/>
+            <w:tcMar>
+              <w:top w:type="dxa" w:w="80"/>
+              <w:left w:type="dxa" w:w="120"/>
+              <w:bottom w:type="dxa" w:w="80"/>
+              <w:right w:type="dxa" w:w="120"/>
+            </w:tcMar>
+          </w:tcPr>
+          <w:p>
+            <w:pPr>
+              <w:spacing w:after="0" w:line="276"/>
+            </w:pPr>
+            <w:r>
+              <w:rPr>
+                <w:sz w:val="21"/>
+                <w:szCs w:val="21"/>
+              </w:rPr>
+              <w:t xml:space="preserve">Un archivo presentado como traducción puede contener cambios de fondo. Compararlo contra la versión anterior antes de transcribirlo costó unos minutos y evitó implementar una base menos estricta que la que define el estándar.</w:t>
+            </w:r>
+          </w:p>
+        </w:tc>
+      </w:tr>
+    </w:tbl>
+    <w:p>
+      <w:pPr>
+        <w:spacing w:after="200"/>
+      </w:pPr>
+    </w:p>
+    <w:p>
       <w:r>
         <w:br w:type="page"/>
       </w:r>
@@ -14511,6 +16035,213 @@
           </w:p>
         </w:tc>
       </w:tr>
+      <w:tr>
+        <w:tc>
+          <w:tcPr>
+            <w:tcW w:type="dxa" w:w="1400"/>
+            <w:tcMar>
+              <w:top w:type="dxa" w:w="80"/>
+              <w:left w:type="dxa" w:w="120"/>
+              <w:bottom w:type="dxa" w:w="80"/>
+              <w:right w:type="dxa" w:w="120"/>
+            </w:tcMar>
+          </w:tcPr>
+          <w:p>
+            <w:pPr>
+              <w:spacing w:after="0" w:line="276"/>
+            </w:pPr>
+            <w:r>
+              <w:rPr>
+                <w:sz w:val="20"/>
+                <w:szCs w:val="20"/>
+              </w:rPr>
+              <w:t xml:space="preserve">02/08/2026</w:t>
+            </w:r>
+          </w:p>
+        </w:tc>
+        <w:tc>
+          <w:tcPr>
+            <w:tcW w:type="dxa" w:w="4200"/>
+            <w:tcMar>
+              <w:top w:type="dxa" w:w="80"/>
+              <w:left w:type="dxa" w:w="120"/>
+              <w:bottom w:type="dxa" w:w="80"/>
+              <w:right w:type="dxa" w:w="120"/>
+            </w:tcMar>
+          </w:tcPr>
+          <w:p>
+            <w:r>
+              <w:rPr>
+                <w:rFonts w:ascii="Consolas" w:cs="Consolas" w:eastAsia="Consolas" w:hAnsi="Consolas"/>
+                <w:sz w:val="19"/>
+                <w:szCs w:val="19"/>
+              </w:rPr>
+              <w:t xml:space="preserve">docs: log schema rebuild decisions and move AI diary into docs folder</w:t>
+            </w:r>
+          </w:p>
+        </w:tc>
+        <w:tc>
+          <w:tcPr>
+            <w:tcW w:type="dxa" w:w="3760"/>
+            <w:tcMar>
+              <w:top w:type="dxa" w:w="80"/>
+              <w:left w:type="dxa" w:w="120"/>
+              <w:bottom w:type="dxa" w:w="80"/>
+              <w:right w:type="dxa" w:w="120"/>
+            </w:tcMar>
+          </w:tcPr>
+          <w:p>
+            <w:pPr>
+              <w:spacing w:after="0" w:line="276"/>
+            </w:pPr>
+            <w:r>
+              <w:rPr>
+                <w:sz w:val="20"/>
+                <w:szCs w:val="20"/>
+              </w:rPr>
+              <w:t xml:space="preserve">Entradas 21 a 25</w:t>
+            </w:r>
+          </w:p>
+        </w:tc>
+      </w:tr>
+      <w:tr>
+        <w:tc>
+          <w:tcPr>
+            <w:tcW w:type="dxa" w:w="1400"/>
+            <w:tcMar>
+              <w:top w:type="dxa" w:w="80"/>
+              <w:left w:type="dxa" w:w="120"/>
+              <w:bottom w:type="dxa" w:w="80"/>
+              <w:right w:type="dxa" w:w="120"/>
+            </w:tcMar>
+          </w:tcPr>
+          <w:p>
+            <w:pPr>
+              <w:spacing w:after="0" w:line="276"/>
+            </w:pPr>
+            <w:r>
+              <w:rPr>
+                <w:sz w:val="20"/>
+                <w:szCs w:val="20"/>
+              </w:rPr>
+              <w:t xml:space="preserve">02/08/2026</w:t>
+            </w:r>
+          </w:p>
+        </w:tc>
+        <w:tc>
+          <w:tcPr>
+            <w:tcW w:type="dxa" w:w="4200"/>
+            <w:tcMar>
+              <w:top w:type="dxa" w:w="80"/>
+              <w:left w:type="dxa" w:w="120"/>
+              <w:bottom w:type="dxa" w:w="80"/>
+              <w:right w:type="dxa" w:w="120"/>
+            </w:tcMar>
+          </w:tcPr>
+          <w:p>
+            <w:r>
+              <w:rPr>
+                <w:rFonts w:ascii="Consolas" w:cs="Consolas" w:eastAsia="Consolas" w:hAnsi="Consolas"/>
+                <w:sz w:val="19"/>
+                <w:szCs w:val="19"/>
+              </w:rPr>
+              <w:t xml:space="preserve">docs: correct database name and refresh setup guide for new contributors</w:t>
+            </w:r>
+          </w:p>
+        </w:tc>
+        <w:tc>
+          <w:tcPr>
+            <w:tcW w:type="dxa" w:w="3760"/>
+            <w:tcMar>
+              <w:top w:type="dxa" w:w="80"/>
+              <w:left w:type="dxa" w:w="120"/>
+              <w:bottom w:type="dxa" w:w="80"/>
+              <w:right w:type="dxa" w:w="120"/>
+            </w:tcMar>
+          </w:tcPr>
+          <w:p>
+            <w:pPr>
+              <w:spacing w:after="0" w:line="276"/>
+            </w:pPr>
+            <w:r>
+              <w:rPr>
+                <w:sz w:val="20"/>
+                <w:szCs w:val="20"/>
+              </w:rPr>
+              <w:t xml:space="preserve">Entrada 26</w:t>
+            </w:r>
+          </w:p>
+        </w:tc>
+      </w:tr>
+      <w:tr>
+        <w:tc>
+          <w:tcPr>
+            <w:tcW w:type="dxa" w:w="1400"/>
+            <w:tcMar>
+              <w:top w:type="dxa" w:w="80"/>
+              <w:left w:type="dxa" w:w="120"/>
+              <w:bottom w:type="dxa" w:w="80"/>
+              <w:right w:type="dxa" w:w="120"/>
+            </w:tcMar>
+          </w:tcPr>
+          <w:p>
+            <w:pPr>
+              <w:spacing w:after="0" w:line="276"/>
+            </w:pPr>
+            <w:r>
+              <w:rPr>
+                <w:sz w:val="20"/>
+                <w:szCs w:val="20"/>
+              </w:rPr>
+              <w:t xml:space="preserve">04/08/2026</w:t>
+            </w:r>
+          </w:p>
+        </w:tc>
+        <w:tc>
+          <w:tcPr>
+            <w:tcW w:type="dxa" w:w="4200"/>
+            <w:tcMar>
+              <w:top w:type="dxa" w:w="80"/>
+              <w:left w:type="dxa" w:w="120"/>
+              <w:bottom w:type="dxa" w:w="80"/>
+              <w:right w:type="dxa" w:w="120"/>
+            </w:tcMar>
+          </w:tcPr>
+          <w:p>
+            <w:r>
+              <w:rPr>
+                <w:rFonts w:ascii="Consolas" w:cs="Consolas" w:eastAsia="Consolas" w:hAnsi="Consolas"/>
+                <w:sz w:val="19"/>
+                <w:szCs w:val="19"/>
+              </w:rPr>
+              <w:t xml:space="preserve">refactor(db): migrate schema and models to English institutional standard</w:t>
+            </w:r>
+          </w:p>
+        </w:tc>
+        <w:tc>
+          <w:tcPr>
+            <w:tcW w:type="dxa" w:w="3760"/>
+            <w:tcMar>
+              <w:top w:type="dxa" w:w="80"/>
+              <w:left w:type="dxa" w:w="120"/>
+              <w:bottom w:type="dxa" w:w="80"/>
+              <w:right w:type="dxa" w:w="120"/>
+            </w:tcMar>
+          </w:tcPr>
+          <w:p>
+            <w:pPr>
+              <w:spacing w:after="0" w:line="276"/>
+            </w:pPr>
+            <w:r>
+              <w:rPr>
+                <w:sz w:val="20"/>
+                <w:szCs w:val="20"/>
+              </w:rPr>
+              <w:t xml:space="preserve">Entradas 27 y 28</w:t>
+            </w:r>
+          </w:p>
+        </w:tc>
+      </w:tr>
     </w:tbl>
     <w:p>
       <w:pPr>
@@ -14554,7 +16285,7 @@
           <w:sz w:val="22"/>
           <w:szCs w:val="22"/>
         </w:rPr>
-        <w:t xml:space="preserve">Entrada 26 — Implementación del motor de reglas sobre reglas_levantamiento y de la pantalla de configuración que ES-01 asigna a la Coordinadora.</w:t>
+        <w:t xml:space="preserve">Entrada 29 — Implementación del motor de reglas sobre waiver_rules y de la pantalla de configuración que ES-01 asigna a la Coordinadora.</w:t>
       </w:r>
     </w:p>
     <w:p>
@@ -14571,7 +16302,7 @@
           <w:sz w:val="22"/>
           <w:szCs w:val="22"/>
         </w:rPr>
-        <w:t xml:space="preserve">Entrada 27 — Resolución del filtro por carrera de la bandeja centralizada (ES-04), pendiente según la Observación 2 de la Entrada 20.</w:t>
+        <w:t xml:space="preserve">Entrada 30 — Resolución del filtro por carrera de la bandeja centralizada (ES-04), pendiente según la Observación 2 de la Entrada 20.</w:t>
       </w:r>
     </w:p>
     <w:p>
@@ -14588,7 +16319,7 @@
           <w:sz w:val="22"/>
           <w:szCs w:val="22"/>
         </w:rPr>
-        <w:t xml:space="preserve">Entrada 28 — Fuente de días feriados para el cálculo de los cinco días hábiles de ES-03, mediante la API REST externa que exige la ficha.</w:t>
+        <w:t xml:space="preserve">Entrada 31 — Fuente de días feriados para el cálculo de los cinco días hábiles de ES-03, mediante la API REST externa que exige la ficha.</w:t>
       </w:r>
     </w:p>
     <w:p>
@@ -14605,7 +16336,7 @@
           <w:sz w:val="22"/>
           <w:szCs w:val="22"/>
         </w:rPr>
-        <w:t xml:space="preserve">Entrada 29 — Estrategia de búsqueda de precedentes de ES-02 y unicidad de convalidaciones_historicas.</w:t>
+        <w:t xml:space="preserve">Entrada 32 — Unicidad de transfer_credit_precedents y estrategia de búsqueda de precedentes de ES-02, pendientes desde la Observación 4 de la Entrada 20.</w:t>
       </w:r>
     </w:p>
     <w:p>
@@ -14622,7 +16353,7 @@
           <w:sz w:val="22"/>
           <w:szCs w:val="22"/>
         </w:rPr>
-        <w:t xml:space="preserve">Entrada 30 — Publicación de las traducciones en lang/es para los mensajes de validación, tras fijar APP_LOCALE en español.</w:t>
+        <w:t xml:space="preserve">Entrada 33 — Publicación de las traducciones en lang/es para los mensajes de validación, tras fijar APP_LOCALE en español.</w:t>
       </w:r>
     </w:p>
     <w:p>
@@ -14639,7 +16370,7 @@
           <w:sz w:val="22"/>
           <w:szCs w:val="22"/>
         </w:rPr>
-        <w:t xml:space="preserve">Entrada 31 — Pruebas unitarias de detección de duplicados, obligatorias por la consecuencia asumida en la Entrada 17.</w:t>
+        <w:t xml:space="preserve">Entrada 34 — Pruebas unitarias de detección de duplicados, obligatorias por la consecuencia asumida en la Entrada 17.</w:t>
       </w:r>
     </w:p>
     <w:sectPr>

</xml_diff>